<commit_message>
refactor: strengthen JCSS scope fit, compliance, and English quality
Scope fit:
- Rewrite abstract with computational social science framing (189 words)
- Open intro with computational social science motivation
- Expand Sect. 6.2 into full methodological contribution section
- Reorder keywords to lead with computational terms
- Add second paragraph to conclusion emphasizing methodology
- Strengthen cover letter (4 reasons for JCSS fit, not 3)

JCSS compliance:
- Remove citation from abstract (guidelines: no unspecified refs)
- Bold 'Fig. N' in captions (Springer requirement)
- Strip trailing punctuation from captions
- Add Google Scholar URL placeholder to author info
- Define all abbreviations at first use in abstract (ABM, ODD)

English quality:
- Polish prose in Introduction, Discussion, Conclusion
- Improve transitions and academic register
- Fix missing comma in cover letter paragraph list
- Tighten phrasing throughout

Co-Authored-By: Tatsuki Onishi <bougtoir@gmail.com>
</commit_message>
<xml_diff>
--- a/tasuki-electoral-model/output/docx/TATSUKI_JCSS.docx
+++ b/tasuki-electoral-model/output/docx/TATSUKI_JCSS.docx
@@ -56,7 +56,7 @@
           <w:i/>
           <w:sz w:val="22"/>
         </w:rPr>
-        <w:t>[Institutional Affiliation]</w:t>
+        <w:t>[Institutional Affiliation, City, Country]</w:t>
       </w:r>
     </w:p>
     <w:p>
@@ -75,7 +75,7 @@
     </w:p>
     <w:p>
       <w:pPr>
-        <w:spacing w:after="480"/>
+        <w:spacing w:after="80"/>
         <w:jc w:val="center"/>
       </w:pPr>
       <w:r>
@@ -89,6 +89,20 @@
     </w:p>
     <w:p>
       <w:pPr>
+        <w:spacing w:after="480"/>
+        <w:jc w:val="center"/>
+      </w:pPr>
+      <w:r>
+        <w:rPr>
+          <w:b w:val="0"/>
+          <w:i/>
+          <w:sz w:val="20"/>
+        </w:rPr>
+        <w:t>Google Scholar: [URL]</w:t>
+      </w:r>
+    </w:p>
+    <w:p>
+      <w:pPr>
         <w:pStyle w:val="Heading1"/>
       </w:pPr>
       <w:r>
@@ -97,7 +111,83 @@
     </w:p>
     <w:p>
       <w:r>
-        <w:t xml:space="preserve">Democratic elections provide citizens with periodic opportunities to hold representatives accountable, yet the binary nature of electoral sanctions (re-election versus removal) offers only a coarse instrument for incentivizing policy fulfillment. We propose Trust-Adjusted Transparent Scoring with Unified Knowledge Integration (TATSUKI), a novel electoral mechanism in which candidates pre-declare weighted policy pledges, third-party evaluators assess fulfillment at term end, and the resulting accountability score modulates a candidate-level trust coefficient influencing effective electoral support in subsequent elections. Using an agent-based model (ABM) compliant with the ODD protocol, we simulate multi-generational electoral dynamics under TATSUKI across a family of influence functions. The model is calibrated using empirical pledge fulfillment data from the Polimeter project (1,050 promises across three Canadian parliamentary terms) and cross-national data from Thomson et al. </w:t>
+        <w:t>How can computational methods inform the design of democratic institutions that promote electoral accountability? We address this question by proposing Trust-Adjusted Transparent Scoring with Unified Knowledge Integration (TATSUKI), a novel electoral mechanism in which candidates pre-declare weighted policy pledges, independent evaluators assess fulfillment at term end, and the resulting accountability score modulates a candidate-level trust coefficient that influences effective electoral support in subsequent contests. We employ an agent-based model (ABM) following the Overview, Design concepts, and Details (ODD) protocol to simulate multi-generational electoral dynamics under TATSUKI across a parameterized family of influence functions. The model is calibrated against empirical pledge-fulfillment data from the Polimeter project (1,050 coded promises spanning three Canadian parliamentary terms) and validated against cross-national benchmarks covering more than 20,000 pledges in 12 countries. Simulation results demonstrate that TATSUKI (i) raises mean accountability scores by approximately 73%, (ii) induces evolutionary selection pressure that favors sincere candidates, (iii) resists adversarial exploitation strategies identified through genetic-algorithm-based stress testing, and (iv) yields counterfactual trust trajectories consistent with observed fulfillment patterns. Sensitivity analysis reveals that concave and sigmoid influence functions offer the most favorable trade-off between incentive strength and manipulation resistance.</w:t>
+      </w:r>
+    </w:p>
+    <w:p>
+      <w:pPr>
+        <w:spacing w:after="360"/>
+      </w:pPr>
+      <w:r>
+        <w:rPr>
+          <w:b w:val="0"/>
+          <w:i/>
+          <w:sz w:val="20"/>
+        </w:rPr>
+        <w:t>Keywords: agent-based modeling; computational institutional design; electoral accountability; pledge fulfillment; genetic algorithm robustness testing; mechanism design</w:t>
+      </w:r>
+    </w:p>
+    <w:p>
+      <w:pPr>
+        <w:pStyle w:val="Heading1"/>
+      </w:pPr>
+      <w:r>
+        <w:t>1. Introduction</w:t>
+      </w:r>
+    </w:p>
+    <w:p>
+      <w:r>
+        <w:t xml:space="preserve">Computational social science increasingly enables researchers to evaluate institutional designs before real-world implementation, using simulation, empirical calibration, and algorithmic stress testing to explore emergent dynamics that resist closed-form analysis. Electoral institutions constitute a particularly promising domain for such computational investigation: elections involve heterogeneous agents, strategic interaction, temporal feedback loops, and measurable outcomes—features that lend themselves naturally to agent-based modeling (ABM). Yet elections also remain constrained by a fundamental limitation: the accountability mechanism linking representatives to voters is largely informal. Citizens evaluate incumbents based on perceived performance </w:t>
+      </w:r>
+      <w:r>
+        <w:rPr>
+          <w:sz w:val="18"/>
+          <w:vertAlign w:val="superscript"/>
+        </w:rPr>
+        <w:t>[1–4]</w:t>
+      </w:r>
+      <w:r>
+        <w:t>, but the electoral sanction itself is binary—re-election or removal—regardless of the degree of policy fulfillment.</w:t>
+      </w:r>
+    </w:p>
+    <w:p>
+      <w:r>
+        <w:t xml:space="preserve">Several innovative proposals have sought to improve democratic decision-making by modifying the structure of elections. Quadratic Voting (QV) allows voters to express preference intensity by purchasing additional votes at quadratic cost </w:t>
+      </w:r>
+      <w:r>
+        <w:rPr>
+          <w:sz w:val="18"/>
+          <w:vertAlign w:val="superscript"/>
+        </w:rPr>
+        <w:t>[5, 6]</w:t>
+      </w:r>
+      <w:r>
+        <w:t xml:space="preserve">. Liquid democracy enables flexible delegation of voting rights </w:t>
+      </w:r>
+      <w:r>
+        <w:rPr>
+          <w:sz w:val="18"/>
+          <w:vertAlign w:val="superscript"/>
+        </w:rPr>
+        <w:t>[7, 8]</w:t>
+      </w:r>
+      <w:r>
+        <w:t xml:space="preserve">. Futarchy separates value judgments from empirical beliefs by employing prediction markets for policy selection </w:t>
+      </w:r>
+      <w:r>
+        <w:rPr>
+          <w:sz w:val="18"/>
+          <w:vertAlign w:val="superscript"/>
+        </w:rPr>
+        <w:t>[9]</w:t>
+      </w:r>
+      <w:r>
+        <w:t>. Each of these approaches modifies a different dimension of the electoral process, yet none directly institutionalizes the retrospective accountability relationship between campaign promises and post-election performance.</w:t>
+      </w:r>
+    </w:p>
+    <w:p>
+      <w:r>
+        <w:t xml:space="preserve">Crucially, a growing empirical literature has established that campaign pledge fulfillment is both measurable and variable—a prerequisite for any computational accountability mechanism. Thomson et al. </w:t>
       </w:r>
       <w:r>
         <w:rPr>
@@ -107,20 +197,92 @@
         <w:t>[10]</w:t>
       </w:r>
       <w:r>
-        <w:t>. Results show that TATSUKI (i) significantly raises mean accountability scores, (ii) induces evolutionary selection pressure favoring sincere candidates, (iii) exhibits robustness to adversarial exploitation strategies discovered via genetic algorithm search, and (iv) produces counterfactual trust trajectories consistent with empirical fulfillment patterns. Sensitivity analysis reveals that concave and sigmoid influence functions offer the best trade-off between incentive strength and resistance to manipulation.</w:t>
+        <w:t xml:space="preserve">, analyzing over 20,000 pledges across 12 countries, found that governing parties fulfill a majority of their promises, with rates varying significantly by institutional context. Pétry and Collette </w:t>
+      </w:r>
+      <w:r>
+        <w:rPr>
+          <w:sz w:val="18"/>
+          <w:vertAlign w:val="superscript"/>
+        </w:rPr>
+        <w:t>[11]</w:t>
+      </w:r>
+      <w:r>
+        <w:t xml:space="preserve"> report a cross-national average fulfillment rate of approximately 67%. These findings suggest that systematic pledge evaluation is feasible and could provide the empirical foundation for a computationally grounded accountability mechanism.</w:t>
       </w:r>
     </w:p>
     <w:p>
-      <w:pPr>
-        <w:spacing w:after="360"/>
-      </w:pPr>
+      <w:r>
+        <w:t>In this paper, we propose Trust-Adjusted Transparent Scoring with Unified Knowledge Integration (TATSUKI), an electoral mechanism that bridges the gap between informal retrospective voting and formal institutional design. Under TATSUKI, candidates pre-declare a weighted portfolio of policy pledges at election time, an independent evaluation body assesses fulfillment at the end of the term, and the resulting accountability score is transformed via an influence function into a trust coefficient that modulates the candidate's effective electoral support in subsequent elections. The trust adjustment attaches to the candidate rather than to individual voters, thereby maintaining compatibility with the one-person-one-vote principle.</w:t>
+      </w:r>
+    </w:p>
+    <w:p>
+      <w:r>
+        <w:t xml:space="preserve">We formalize TATSUKI as a family of mechanisms parameterized by the choice of influence function ω(S) and employ agent-based modeling—a computational approach particularly well-suited to exploring emergent dynamics in complex social systems—to investigate the system's dynamic properties. Following the ODD protocol </w:t>
+      </w:r>
       <w:r>
         <w:rPr>
-          <w:b w:val="0"/>
-          <w:i/>
-          <w:sz w:val="20"/>
+          <w:sz w:val="18"/>
+          <w:vertAlign w:val="superscript"/>
         </w:rPr>
-        <w:t>Keywords: electoral accountability; agent-based model; computational social science; mechanism design; pledge fulfillment; trust coefficient</w:t>
+        <w:t>[12]</w:t>
+      </w:r>
+      <w:r>
+        <w:t>, we simulate multi-generational electoral competition among heterogeneous candidate types (sincere, populist, and strategic-deceptive) and examine equilibrium outcomes, evolutionary dynamics, and robustness to adversarial exploitation discovered through genetic-algorithm search. The computational methodology itself constitutes a contribution: we demonstrate how ABM, empirical calibration, and algorithmic adversarial testing can be integrated to evaluate proposed institutional designs before real-world implementation. Our specific contributions are as follows:</w:t>
+      </w:r>
+    </w:p>
+    <w:p>
+      <w:r>
+        <w:t>1. We introduce TATSUKI, a formal electoral mechanism that institutionalizes retrospective accountability by linking pre-declared pledge weights to post-term trust coefficients.</w:t>
+      </w:r>
+    </w:p>
+    <w:p>
+      <w:r>
+        <w:t>2. We specify a family of influence functions ω(S) and analyze their theoretical properties, including incentive compatibility conditions and manipulation resistance.</w:t>
+      </w:r>
+    </w:p>
+    <w:p>
+      <w:r>
+        <w:t>3. We present an ODD-compliant agent-based model simulating multi-generational electoral dynamics under TATSUKI, demonstrating its capacity to select for sincere candidates.</w:t>
+      </w:r>
+    </w:p>
+    <w:p>
+      <w:r>
+        <w:t>4. We conduct adversarial robustness analysis using genetic algorithms to identify and characterize the most effective exploitation strategies for each influence function variant.</w:t>
+      </w:r>
+    </w:p>
+    <w:p>
+      <w:r>
+        <w:t>5. We provide a systematic comparison of TATSUKI with related electoral reform proposals, establishing its unique position in the theoretical landscape.</w:t>
+      </w:r>
+    </w:p>
+    <w:p>
+      <w:r>
+        <w:t xml:space="preserve">6. We calibrate the model using empirical pledge fulfillment data from the Polimeter project </w:t>
+      </w:r>
+      <w:r>
+        <w:rPr>
+          <w:sz w:val="18"/>
+          <w:vertAlign w:val="superscript"/>
+        </w:rPr>
+        <w:t>[13]</w:t>
+      </w:r>
+      <w:r>
+        <w:t xml:space="preserve"> and the Comparative Party Pledges Database </w:t>
+      </w:r>
+      <w:r>
+        <w:rPr>
+          <w:sz w:val="18"/>
+          <w:vertAlign w:val="superscript"/>
+        </w:rPr>
+        <w:t>[10]</w:t>
+      </w:r>
+      <w:r>
+        <w:t>, and conduct counterfactual analysis demonstrating TATSUKI's predicted effects on real-world political actors.</w:t>
+      </w:r>
+    </w:p>
+    <w:p>
+      <w:r>
+        <w:t>The remainder of this paper is organized as follows. Section 2 reviews related work. Section 3 presents the formal model. Section 4 describes the agent-based simulation following the ODD protocol. Section 5 reports simulation results, including empirical calibration and counterfactual analysis using Polimeter data. Section 6 discusses implications and limitations. Section 7 concludes.</w:t>
       </w:r>
     </w:p>
     <w:p>
@@ -128,37 +290,156 @@
         <w:pStyle w:val="Heading1"/>
       </w:pPr>
       <w:r>
-        <w:t>1. Introduction</w:t>
+        <w:t>2. Related Work</w:t>
       </w:r>
     </w:p>
     <w:p>
-      <w:r>
-        <w:t xml:space="preserve">Elections constitute the cornerstone of representative democracy, providing citizens with periodic opportunities to evaluate and sanction their representatives </w:t>
+      <w:pPr>
+        <w:pStyle w:val="Heading2"/>
+      </w:pPr>
+      <w:r>
+        <w:t>2.1 Retrospective Voting and Electoral Accountability</w:t>
+      </w:r>
+    </w:p>
+    <w:p>
+      <w:r>
+        <w:t xml:space="preserve">The retrospective voting tradition, initiated by Key </w:t>
       </w:r>
       <w:r>
         <w:rPr>
           <w:sz w:val="18"/>
           <w:vertAlign w:val="superscript"/>
         </w:rPr>
-        <w:t>[1]</w:t>
-      </w:r>
-      <w:r>
-        <w:t xml:space="preserve">. The retrospective voting literature has documented that voters do, in practice, condition their electoral choices on perceived government performance </w:t>
+        <w:t>[3]</w:t>
+      </w:r>
+      <w:r>
+        <w:t xml:space="preserve"> and formalized by Fiorina </w:t>
       </w:r>
       <w:r>
         <w:rPr>
           <w:sz w:val="18"/>
           <w:vertAlign w:val="superscript"/>
         </w:rPr>
-        <w:t>[2–4]</w:t>
-      </w:r>
-      <w:r>
-        <w:t>. However, this accountability mechanism operates informally: voters must independently assess complex policy outcomes, and the electoral sanction itself is binary—re-election or removal—regardless of the degree of policy fulfillment or failure.</w:t>
+        <w:t>[2]</w:t>
+      </w:r>
+      <w:r>
+        <w:t xml:space="preserve">, posits that voters evaluate incumbents based on past performance rather than prospective policy promises. Healy and Malhotra </w:t>
+      </w:r>
+      <w:r>
+        <w:rPr>
+          <w:sz w:val="18"/>
+          <w:vertAlign w:val="superscript"/>
+        </w:rPr>
+        <w:t>[4]</w:t>
+      </w:r>
+      <w:r>
+        <w:t xml:space="preserve"> provide a comprehensive review, noting that voters are often myopic, weighting recent events disproportionately, and susceptible to irrelevant factors. TATSUKI addresses these limitations by institutionalizing the retrospective evaluation process, replacing subjective voter assessments with structured third-party evaluation of pre-declared pledges.</w:t>
       </w:r>
     </w:p>
     <w:p>
       <w:r>
-        <w:t xml:space="preserve">Several innovative proposals have sought to improve democratic decision-making by modifying the structure of elections. Quadratic Voting (QV) addresses the failure to capture preference intensity by allowing voters to purchase additional votes at quadratic cost </w:t>
+        <w:t xml:space="preserve">Formal models of electoral accountability, notably Barro </w:t>
+      </w:r>
+      <w:r>
+        <w:rPr>
+          <w:sz w:val="18"/>
+          <w:vertAlign w:val="superscript"/>
+        </w:rPr>
+        <w:t>[14]</w:t>
+      </w:r>
+      <w:r>
+        <w:t xml:space="preserve"> and Ferejohn </w:t>
+      </w:r>
+      <w:r>
+        <w:rPr>
+          <w:sz w:val="18"/>
+          <w:vertAlign w:val="superscript"/>
+        </w:rPr>
+        <w:t>[15]</w:t>
+      </w:r>
+      <w:r>
+        <w:t xml:space="preserve">, frame the voter-politician relationship as a principal-agent problem. In these models, voters employ threshold strategies: re-elect the incumbent if performance exceeds a reservation utility, otherwise remove. Besley </w:t>
+      </w:r>
+      <w:r>
+        <w:rPr>
+          <w:sz w:val="18"/>
+          <w:vertAlign w:val="superscript"/>
+        </w:rPr>
+        <w:t>[16]</w:t>
+      </w:r>
+      <w:r>
+        <w:t xml:space="preserve"> extends this framework to distinguish selection and disciplining effects. TATSUKI generalizes the binary sanction of these models into a continuous trust coefficient τ = ω(S), providing finer-grained incentives for policy fulfillment.</w:t>
+      </w:r>
+    </w:p>
+    <w:p>
+      <w:pPr>
+        <w:pStyle w:val="Heading2"/>
+      </w:pPr>
+      <w:r>
+        <w:t>2.2 Mechanism Design and Social Choice Theory</w:t>
+      </w:r>
+    </w:p>
+    <w:p>
+      <w:r>
+        <w:t xml:space="preserve">Arrow's impossibility theorem </w:t>
+      </w:r>
+      <w:r>
+        <w:rPr>
+          <w:sz w:val="18"/>
+          <w:vertAlign w:val="superscript"/>
+        </w:rPr>
+        <w:t>[17]</w:t>
+      </w:r>
+      <w:r>
+        <w:t xml:space="preserve"> and the Gibbard–Satterthwaite theorem </w:t>
+      </w:r>
+      <w:r>
+        <w:rPr>
+          <w:sz w:val="18"/>
+          <w:vertAlign w:val="superscript"/>
+        </w:rPr>
+        <w:t>[18, 19]</w:t>
+      </w:r>
+      <w:r>
+        <w:t xml:space="preserve"> establish fundamental limits on ranked-choice voting systems. Dasgupta and Maskin </w:t>
+      </w:r>
+      <w:r>
+        <w:rPr>
+          <w:sz w:val="18"/>
+          <w:vertAlign w:val="superscript"/>
+        </w:rPr>
+        <w:t>[20]</w:t>
+      </w:r>
+      <w:r>
+        <w:t xml:space="preserve"> provide recent results on strategy-proofness under majority rule. TATSUKI does not modify the preference aggregation rule itself but introduces an additional dimension—dynamic trust weighting—that operates upstream of the aggregation step. This situates TATSUKI outside the direct scope of classical impossibility results, though it raises new questions about strategic manipulation in the pledge-declaration and evaluation stages.</w:t>
+      </w:r>
+    </w:p>
+    <w:p>
+      <w:r>
+        <w:t xml:space="preserve">Acemoglu, Golosov, and Tsyvinski </w:t>
+      </w:r>
+      <w:r>
+        <w:rPr>
+          <w:sz w:val="18"/>
+          <w:vertAlign w:val="superscript"/>
+        </w:rPr>
+        <w:t>[21]</w:t>
+      </w:r>
+      <w:r>
+        <w:t xml:space="preserve"> study the political economy of mechanisms, analyzing dynamic incentive provision for politicians. Their framework informs our treatment of intertemporal incentives, though TATSUKI differs in making the incentive structure transparent and parameterized through the publicly known influence function ω(S).</w:t>
+      </w:r>
+    </w:p>
+    <w:p>
+      <w:pPr>
+        <w:pStyle w:val="Heading2"/>
+      </w:pPr>
+      <w:r>
+        <w:t>2.3 Alternative Electoral Reforms</w:t>
+      </w:r>
+    </w:p>
+    <w:p>
+      <w:r>
+        <w:t xml:space="preserve">Quadratic Voting </w:t>
       </w:r>
       <w:r>
         <w:rPr>
@@ -168,17 +449,22 @@
         <w:t>[5, 6]</w:t>
       </w:r>
       <w:r>
-        <w:t xml:space="preserve">. Liquid democracy enables flexible delegation of voting rights </w:t>
+        <w:t xml:space="preserve"> allows voters to express preference intensity by purchasing votes at quadratic cost, achieving approximate welfare optimality under certain conditions. While QV modifies the voting act itself, TATSUKI modifies the consequences of past voting outcomes. The two mechanisms are formally complementary and could, in principle, be combined.</w:t>
+      </w:r>
+    </w:p>
+    <w:p>
+      <w:r>
+        <w:t xml:space="preserve">Liquid democracy </w:t>
       </w:r>
       <w:r>
         <w:rPr>
           <w:sz w:val="18"/>
           <w:vertAlign w:val="superscript"/>
         </w:rPr>
-        <w:t>[7, 8]</w:t>
-      </w:r>
-      <w:r>
-        <w:t xml:space="preserve">. Futarchy separates value judgments from empirical beliefs by employing prediction markets for policy selection </w:t>
+        <w:t>[7, 22, 8]</w:t>
+      </w:r>
+      <w:r>
+        <w:t xml:space="preserve"> enables transitive delegation of voting rights, dissolving the boundary between direct and representative democracy. In contrast, TATSUKI preserves the representative structure while strengthening accountability within it. Futarchy </w:t>
       </w:r>
       <w:r>
         <w:rPr>
@@ -188,12 +474,20 @@
         <w:t>[9]</w:t>
       </w:r>
       <w:r>
-        <w:t>. Each of these approaches modifies a different dimension of the electoral process, yet none directly institutionalizes the retrospective accountability relationship between campaign promises and post-election performance.</w:t>
+        <w:t xml:space="preserve"> delegates policy decisions to prediction markets, separating values from beliefs. TATSUKI implements a different separation: pre-election pledges from post-election evaluation.</w:t>
       </w:r>
     </w:p>
     <w:p>
-      <w:r>
-        <w:t xml:space="preserve">Meanwhile, the empirical literature on campaign pledge fulfillment has established that promise keeping is both measurable and variable. Thomson et al. </w:t>
+      <w:pPr>
+        <w:pStyle w:val="Heading2"/>
+      </w:pPr>
+      <w:r>
+        <w:t>2.4 Campaign Pledge Fulfillment</w:t>
+      </w:r>
+    </w:p>
+    <w:p>
+      <w:r>
+        <w:t xml:space="preserve">Thomson et al. </w:t>
       </w:r>
       <w:r>
         <w:rPr>
@@ -203,100 +497,27 @@
         <w:t>[10]</w:t>
       </w:r>
       <w:r>
-        <w:t xml:space="preserve">, analyzing over 20,000 pledges across 12 countries, found that governing parties fulfill a majority of their promises, with rates varying significantly based on institutional context. Pétry and Collette </w:t>
+        <w:t xml:space="preserve"> conduct the most comprehensive comparative study of pledge fulfillment, analyzing over 20,000 pledges across 57 election campaigns in 12 countries. They find that governing parties fulfill a majority of pledges, with single-party governments achieving higher rates than coalitions. Naurin, Royed, and Thomson </w:t>
       </w:r>
       <w:r>
         <w:rPr>
           <w:sz w:val="18"/>
           <w:vertAlign w:val="superscript"/>
         </w:rPr>
-        <w:t>[11]</w:t>
-      </w:r>
-      <w:r>
-        <w:t xml:space="preserve"> report a cross-national average fulfillment rate of approximately 67%. These findings suggest that systematic evaluation of pledge fulfillment is feasible and could serve as the empirical foundation for an institutionalized accountability mechanism.</w:t>
-      </w:r>
-    </w:p>
-    <w:p>
-      <w:r>
-        <w:t>In this paper, we propose Trust-Adjusted Transparent Scoring with Unified Knowledge Integration (TATSUKI), an electoral mechanism that bridges the gap between informal retrospective voting and formal institutional design. Under TATSUKI, candidates pre-declare a weighted portfolio of policy pledges at election time, an independent evaluation body assesses fulfillment at the end of the term, and the resulting accountability score is transformed via an influence function into a trust coefficient that modulates the candidate's effective electoral support in subsequent elections. Crucially, we frame this adjustment as a candidate-level trust coefficient rather than a modification of individual voter weights, thereby maintaining compatibility with the one-person-one-vote principle.</w:t>
-      </w:r>
-    </w:p>
-    <w:p>
-      <w:r>
-        <w:t xml:space="preserve">We formalize TATSUKI as a family of mechanisms parameterized by the choice of influence function ω(S), and employ agent-based modeling (ABM)—a computational approach well-suited to exploring emergent dynamics in complex social systems—to investigate the system's dynamic properties. Following the ODD protocol </w:t>
+        <w:t>[23]</w:t>
+      </w:r>
+      <w:r>
+        <w:t xml:space="preserve"> further document cross-national variation. Bytzek et al. </w:t>
       </w:r>
       <w:r>
         <w:rPr>
           <w:sz w:val="18"/>
           <w:vertAlign w:val="superscript"/>
         </w:rPr>
-        <w:t>[12]</w:t>
-      </w:r>
-      <w:r>
-        <w:t>, we simulate multi-generational electoral competition among heterogeneous candidate types (sincere, populist, and strategic-deceptive) and examine equilibrium outcomes, evolutionary dynamics, and robustness to adversarial exploitation via genetic algorithm search. Our contributions are as follows:</w:t>
-      </w:r>
-    </w:p>
-    <w:p>
-      <w:r>
-        <w:t>1. We introduce TATSUKI, a formal electoral mechanism that institutionalizes retrospective accountability by linking pre-declared pledge weights to post-term trust coefficients.</w:t>
-      </w:r>
-    </w:p>
-    <w:p>
-      <w:r>
-        <w:t>2. We specify a family of influence functions ω(S) and analyze their theoretical properties, including incentive compatibility conditions and manipulation resistance.</w:t>
-      </w:r>
-    </w:p>
-    <w:p>
-      <w:r>
-        <w:t>3. We present an ODD-compliant agent-based model simulating multi-generational electoral dynamics under TATSUKI, demonstrating its capacity to select for sincere candidates.</w:t>
-      </w:r>
-    </w:p>
-    <w:p>
-      <w:r>
-        <w:t>4. We conduct adversarial robustness analysis using genetic algorithms to identify and characterize the most effective exploitation strategies for each influence function variant.</w:t>
-      </w:r>
-    </w:p>
-    <w:p>
-      <w:r>
-        <w:t>5. We provide a systematic comparison of TATSUKI with related electoral reform proposals, establishing its unique position in the theoretical landscape.</w:t>
-      </w:r>
-    </w:p>
-    <w:p>
-      <w:r>
-        <w:t xml:space="preserve">6. We calibrate the model using empirical pledge fulfillment data from the Polimeter project </w:t>
-      </w:r>
-      <w:r>
-        <w:rPr>
-          <w:sz w:val="18"/>
-          <w:vertAlign w:val="superscript"/>
-        </w:rPr>
-        <w:t>[13]</w:t>
-      </w:r>
-      <w:r>
-        <w:t xml:space="preserve"> and the Comparative Party Pledges Database </w:t>
-      </w:r>
-      <w:r>
-        <w:rPr>
-          <w:sz w:val="18"/>
-          <w:vertAlign w:val="superscript"/>
-        </w:rPr>
-        <w:t>[10]</w:t>
-      </w:r>
-      <w:r>
-        <w:t>, and conduct counterfactual analysis demonstrating TATSUKI's predicted effects on real-world political actors.</w:t>
-      </w:r>
-    </w:p>
-    <w:p>
-      <w:r>
-        <w:t>The remainder of this paper is organized as follows. Section 2 reviews related work. Section 3 presents the formal model. Section 4 describes the agent-based simulation following the ODD protocol. Section 5 reports simulation results, including empirical calibration and counterfactual analysis using Polimeter data. Section 6 discusses implications and limitations. Section 7 concludes.</w:t>
-      </w:r>
-    </w:p>
-    <w:p>
-      <w:pPr>
-        <w:pStyle w:val="Heading1"/>
-      </w:pPr>
-      <w:r>
-        <w:t>2. Related Work</w:t>
+        <w:t>[24]</w:t>
+      </w:r>
+      <w:r>
+        <w:t xml:space="preserve"> demonstrate that pledge fulfillment perceptions significantly affect political trust. These findings provide the empirical foundation for TATSUKI's core assumption that pledge fulfillment can be systematically measured and used as an institutional input.</w:t>
       </w:r>
     </w:p>
     <w:p>
@@ -304,239 +525,12 @@
         <w:pStyle w:val="Heading2"/>
       </w:pPr>
       <w:r>
-        <w:t>2.1 Retrospective Voting and Electoral Accountability</w:t>
+        <w:t>2.5 Agent-Based Models of Electoral Systems</w:t>
       </w:r>
     </w:p>
     <w:p>
       <w:r>
-        <w:t xml:space="preserve">The retrospective voting tradition, initiated by Key </w:t>
-      </w:r>
-      <w:r>
-        <w:rPr>
-          <w:sz w:val="18"/>
-          <w:vertAlign w:val="superscript"/>
-        </w:rPr>
-        <w:t>[3]</w:t>
-      </w:r>
-      <w:r>
-        <w:t xml:space="preserve"> and formalized by Fiorina </w:t>
-      </w:r>
-      <w:r>
-        <w:rPr>
-          <w:sz w:val="18"/>
-          <w:vertAlign w:val="superscript"/>
-        </w:rPr>
-        <w:t>[2]</w:t>
-      </w:r>
-      <w:r>
-        <w:t xml:space="preserve">, posits that voters evaluate incumbents based on past performance rather than prospective policy promises. Healy and Malhotra </w:t>
-      </w:r>
-      <w:r>
-        <w:rPr>
-          <w:sz w:val="18"/>
-          <w:vertAlign w:val="superscript"/>
-        </w:rPr>
-        <w:t>[4]</w:t>
-      </w:r>
-      <w:r>
-        <w:t xml:space="preserve"> provide a comprehensive review, noting that voters are often myopic, weighting recent events disproportionately, and susceptible to irrelevant factors. TATSUKI addresses these limitations by institutionalizing the retrospective evaluation process, replacing subjective voter assessments with structured third-party evaluation of pre-declared pledges.</w:t>
-      </w:r>
-    </w:p>
-    <w:p>
-      <w:r>
-        <w:t xml:space="preserve">Formal models of electoral accountability, notably Barro </w:t>
-      </w:r>
-      <w:r>
-        <w:rPr>
-          <w:sz w:val="18"/>
-          <w:vertAlign w:val="superscript"/>
-        </w:rPr>
-        <w:t>[14]</w:t>
-      </w:r>
-      <w:r>
-        <w:t xml:space="preserve"> and Ferejohn </w:t>
-      </w:r>
-      <w:r>
-        <w:rPr>
-          <w:sz w:val="18"/>
-          <w:vertAlign w:val="superscript"/>
-        </w:rPr>
-        <w:t>[15]</w:t>
-      </w:r>
-      <w:r>
-        <w:t xml:space="preserve">, frame the voter-politician relationship as a principal-agent problem. In these models, voters employ threshold strategies: re-elect the incumbent if performance exceeds a reservation utility, otherwise remove. Besley </w:t>
-      </w:r>
-      <w:r>
-        <w:rPr>
-          <w:sz w:val="18"/>
-          <w:vertAlign w:val="superscript"/>
-        </w:rPr>
-        <w:t>[16]</w:t>
-      </w:r>
-      <w:r>
-        <w:t xml:space="preserve"> extends this framework to distinguish selection and disciplining effects. TATSUKI generalizes the binary sanction of these models into a continuous trust coefficient τ = ω(S), providing finer-grained incentives for policy fulfillment.</w:t>
-      </w:r>
-    </w:p>
-    <w:p>
-      <w:pPr>
-        <w:pStyle w:val="Heading2"/>
-      </w:pPr>
-      <w:r>
-        <w:t>2.2 Mechanism Design and Social Choice Theory</w:t>
-      </w:r>
-    </w:p>
-    <w:p>
-      <w:r>
-        <w:t xml:space="preserve">Arrow's impossibility theorem </w:t>
-      </w:r>
-      <w:r>
-        <w:rPr>
-          <w:sz w:val="18"/>
-          <w:vertAlign w:val="superscript"/>
-        </w:rPr>
-        <w:t>[17]</w:t>
-      </w:r>
-      <w:r>
-        <w:t xml:space="preserve"> and the Gibbard–Satterthwaite theorem </w:t>
-      </w:r>
-      <w:r>
-        <w:rPr>
-          <w:sz w:val="18"/>
-          <w:vertAlign w:val="superscript"/>
-        </w:rPr>
-        <w:t>[18, 19]</w:t>
-      </w:r>
-      <w:r>
-        <w:t xml:space="preserve"> establish fundamental limits on ranked-choice voting systems. Dasgupta and Maskin </w:t>
-      </w:r>
-      <w:r>
-        <w:rPr>
-          <w:sz w:val="18"/>
-          <w:vertAlign w:val="superscript"/>
-        </w:rPr>
-        <w:t>[20]</w:t>
-      </w:r>
-      <w:r>
-        <w:t xml:space="preserve"> provide recent results on strategy-proofness under majority rule. TATSUKI does not modify the preference aggregation rule itself but introduces an additional dimension—dynamic trust weighting—that operates upstream of the aggregation step. This situates TATSUKI outside the direct scope of classical impossibility results, though it raises new questions about strategic manipulation in the pledge-declaration and evaluation stages.</w:t>
-      </w:r>
-    </w:p>
-    <w:p>
-      <w:r>
-        <w:t xml:space="preserve">Acemoglu, Golosov, and Tsyvinski </w:t>
-      </w:r>
-      <w:r>
-        <w:rPr>
-          <w:sz w:val="18"/>
-          <w:vertAlign w:val="superscript"/>
-        </w:rPr>
-        <w:t>[21]</w:t>
-      </w:r>
-      <w:r>
-        <w:t xml:space="preserve"> study the political economy of mechanisms, analyzing dynamic incentive provision for politicians. Their framework informs our treatment of intertemporal incentives, though TATSUKI differs in making the incentive structure transparent and parameterized through the publicly known influence function ω(S).</w:t>
-      </w:r>
-    </w:p>
-    <w:p>
-      <w:pPr>
-        <w:pStyle w:val="Heading2"/>
-      </w:pPr>
-      <w:r>
-        <w:t>2.3 Alternative Electoral Reforms</w:t>
-      </w:r>
-    </w:p>
-    <w:p>
-      <w:r>
-        <w:t xml:space="preserve">Quadratic Voting </w:t>
-      </w:r>
-      <w:r>
-        <w:rPr>
-          <w:sz w:val="18"/>
-          <w:vertAlign w:val="superscript"/>
-        </w:rPr>
-        <w:t>[5, 6]</w:t>
-      </w:r>
-      <w:r>
-        <w:t xml:space="preserve"> allows voters to express preference intensity by purchasing votes at quadratic cost, achieving approximate welfare optimality under certain conditions. While QV modifies the voting act itself, TATSUKI modifies the consequences of past voting outcomes. The two mechanisms are formally complementary and could, in principle, be combined.</w:t>
-      </w:r>
-    </w:p>
-    <w:p>
-      <w:r>
-        <w:t xml:space="preserve">Liquid democracy </w:t>
-      </w:r>
-      <w:r>
-        <w:rPr>
-          <w:sz w:val="18"/>
-          <w:vertAlign w:val="superscript"/>
-        </w:rPr>
-        <w:t>[7, 22, 8]</w:t>
-      </w:r>
-      <w:r>
-        <w:t xml:space="preserve"> enables transitive delegation of voting rights, dissolving the boundary between direct and representative democracy. In contrast, TATSUKI preserves the representative structure while strengthening accountability within it. Futarchy </w:t>
-      </w:r>
-      <w:r>
-        <w:rPr>
-          <w:sz w:val="18"/>
-          <w:vertAlign w:val="superscript"/>
-        </w:rPr>
-        <w:t>[9]</w:t>
-      </w:r>
-      <w:r>
-        <w:t xml:space="preserve"> delegates policy decisions to prediction markets, separating values from beliefs. TATSUKI implements a different separation: pre-election pledges from post-election evaluation.</w:t>
-      </w:r>
-    </w:p>
-    <w:p>
-      <w:pPr>
-        <w:pStyle w:val="Heading2"/>
-      </w:pPr>
-      <w:r>
-        <w:t>2.4 Campaign Pledge Fulfillment</w:t>
-      </w:r>
-    </w:p>
-    <w:p>
-      <w:r>
-        <w:t xml:space="preserve">Thomson et al. </w:t>
-      </w:r>
-      <w:r>
-        <w:rPr>
-          <w:sz w:val="18"/>
-          <w:vertAlign w:val="superscript"/>
-        </w:rPr>
-        <w:t>[10]</w:t>
-      </w:r>
-      <w:r>
-        <w:t xml:space="preserve"> conduct the most comprehensive comparative study of pledge fulfillment, analyzing over 20,000 pledges across 57 election campaigns in 12 countries. They find that governing parties fulfill a majority of pledges, with single-party governments achieving higher rates than coalitions. Naurin, Royed, and Thomson </w:t>
-      </w:r>
-      <w:r>
-        <w:rPr>
-          <w:sz w:val="18"/>
-          <w:vertAlign w:val="superscript"/>
-        </w:rPr>
-        <w:t>[23]</w:t>
-      </w:r>
-      <w:r>
-        <w:t xml:space="preserve"> further document cross-national variation. Bytzek et al. </w:t>
-      </w:r>
-      <w:r>
-        <w:rPr>
-          <w:sz w:val="18"/>
-          <w:vertAlign w:val="superscript"/>
-        </w:rPr>
-        <w:t>[24]</w:t>
-      </w:r>
-      <w:r>
-        <w:t xml:space="preserve"> demonstrate that pledge fulfillment perceptions significantly affect political trust. These findings provide the empirical foundation for TATSUKI's core assumption that pledge fulfillment can be systematically measured and used as an institutional input.</w:t>
-      </w:r>
-    </w:p>
-    <w:p>
-      <w:pPr>
-        <w:pStyle w:val="Heading2"/>
-      </w:pPr>
-      <w:r>
-        <w:t>2.5 Agent-Based Models of Electoral Systems</w:t>
-      </w:r>
-    </w:p>
-    <w:p>
-      <w:r>
-        <w:t xml:space="preserve">Agent-based models (ABMs) have been widely applied to electoral dynamics, leveraging computational simulation to explore emergent phenomena in complex social systems. Laver </w:t>
+        <w:t xml:space="preserve">Agent-based models have been widely applied to electoral dynamics, leveraging computational simulation to explore emergent phenomena in complex social systems. Laver </w:t>
       </w:r>
       <w:r>
         <w:rPr>
@@ -566,7 +560,7 @@
         <w:t>[27]</w:t>
       </w:r>
       <w:r>
-        <w:t xml:space="preserve"> employ replicator dynamics to study candidate positioning, finding that complex evolutionary dynamics emerge even from simple behavioral heuristics. Our ABM builds on this tradition by introducing the TATSUKI mechanism as the institutional context within which candidate strategies evolve.</w:t>
+        <w:t xml:space="preserve"> employ replicator dynamics to study candidate positioning, finding that complex evolutionary dynamics emerge even from simple behavioral heuristics. Our ABM builds on this computational tradition by introducing the TATSUKI mechanism as the institutional context within which candidate strategies evolve, and extends it with genetic-algorithm-based adversarial testing and empirical calibration against large-scale pledge-fulfillment databases.</w:t>
       </w:r>
     </w:p>
     <w:p>
@@ -616,10 +610,16 @@
       </w:pPr>
       <w:r>
         <w:rPr>
-          <w:i/>
+          <w:b/>
           <w:sz w:val="20"/>
         </w:rPr>
-        <w:t>Fig. 1 Theoretical positioning of TATSUKI relative to existing electoral reform proposals. The horizontal axis represents departure from one-person-one-vote; the vertical axis represents temporal orientation (retrospective to prospective).</w:t>
+        <w:t xml:space="preserve">Fig. 1 </w:t>
+      </w:r>
+      <w:r>
+        <w:rPr>
+          <w:sz w:val="20"/>
+        </w:rPr>
+        <w:t>Theoretical positioning of TATSUKI relative to existing electoral reform proposals. The horizontal axis represents departure from one-person-one-vote; the vertical axis represents temporal orientation (retrospective to prospective)</w:t>
       </w:r>
     </w:p>
     <w:p>
@@ -690,10 +690,16 @@
       </w:pPr>
       <w:r>
         <w:rPr>
-          <w:i/>
+          <w:b/>
           <w:sz w:val="20"/>
         </w:rPr>
-        <w:t>Fig. 2 Conceptual overview of the TATSUKI mechanism showing the six phases of the electoral cycle: pledge declaration, election, term in office, fulfillment evaluation, accountability scoring, and trust coefficient update.</w:t>
+        <w:t xml:space="preserve">Fig. 2 </w:t>
+      </w:r>
+      <w:r>
+        <w:rPr>
+          <w:sz w:val="20"/>
+        </w:rPr>
+        <w:t>Conceptual overview of the TATSUKI mechanism showing the six phases of the electoral cycle: pledge declaration, election, term in office, fulfillment evaluation, accountability scoring, and trust coefficient update</w:t>
       </w:r>
     </w:p>
     <w:p>
@@ -916,10 +922,16 @@
       </w:pPr>
       <w:r>
         <w:rPr>
-          <w:i/>
+          <w:b/>
           <w:sz w:val="20"/>
         </w:rPr>
-        <w:t>Fig. 3 Family of influence functions ω(S). (a) Different functional forms mapping accountability score S to trust coefficient τ. (b) Sensitivity to the parameter range [τ_min, τ_max] under the concave specification.</w:t>
+        <w:t xml:space="preserve">Fig. 3 </w:t>
+      </w:r>
+      <w:r>
+        <w:rPr>
+          <w:sz w:val="20"/>
+        </w:rPr>
+        <w:t>Family of influence functions ω(S). (a) Different functional forms mapping accountability score S to trust coefficient τ. (b) Sensitivity to the parameter range [τ_min, τ_max] under the concave specification</w:t>
       </w:r>
     </w:p>
     <w:p>
@@ -1224,10 +1236,16 @@
       </w:pPr>
       <w:r>
         <w:rPr>
-          <w:i/>
+          <w:b/>
           <w:sz w:val="20"/>
         </w:rPr>
-        <w:t>Fig. 4 Baseline simulation results over 30 electoral cycles. (a) Mean accountability score trajectory under TATSUKI (concave ω) versus standard elections. Shaded regions indicate ±1 SD. (b) Evolutionary dynamics of candidate type proportions under TATSUKI. (c) Distribution of trust coefficients in early (cycles 1–5) versus late (cycles 25–30) periods. (d) Mean voter welfare comparison across TATSUKI, standard elections, and a QV baseline.</w:t>
+        <w:t xml:space="preserve">Fig. 4 </w:t>
+      </w:r>
+      <w:r>
+        <w:rPr>
+          <w:sz w:val="20"/>
+        </w:rPr>
+        <w:t>Baseline simulation results over 30 electoral cycles. (a) Mean accountability score trajectory under TATSUKI (concave ω) versus standard elections. Shaded regions indicate ±1 SD. (b) Evolutionary dynamics of candidate type proportions under TATSUKI. (c) Distribution of trust coefficients in early (cycles 1–5) versus late (cycles 25–30) periods. (d) Mean voter welfare comparison across TATSUKI, standard elections, and a QV baseline</w:t>
       </w:r>
     </w:p>
     <w:p>
@@ -1300,10 +1318,16 @@
       </w:pPr>
       <w:r>
         <w:rPr>
-          <w:i/>
+          <w:b/>
           <w:sz w:val="20"/>
         </w:rPr>
-        <w:t>Fig. 5 Sensitivity analysis. (a) Heatmap of equilibrium mean accountability score as a function of τ_min and τ_max under the concave influence function. Warmer colors indicate higher accountability. (b) Scalability analysis showing convergence speed and final accountability as functions of the number of candidates.</w:t>
+        <w:t xml:space="preserve">Fig. 5 </w:t>
+      </w:r>
+      <w:r>
+        <w:rPr>
+          <w:sz w:val="20"/>
+        </w:rPr>
+        <w:t>Sensitivity analysis. (a) Heatmap of equilibrium mean accountability score as a function of τ_min and τ_max under the concave influence function. Warmer colors indicate higher accountability. (b) Scalability analysis showing convergence speed and final accountability as functions of the number of candidates</w:t>
       </w:r>
     </w:p>
     <w:p>
@@ -1371,10 +1395,16 @@
       </w:pPr>
       <w:r>
         <w:rPr>
-          <w:i/>
+          <w:b/>
           <w:sz w:val="20"/>
         </w:rPr>
-        <w:t>Fig. 6 Adversarial robustness analysis. (a) Exploitability index by strategy type and influence function. Lower values indicate greater resistance to manipulation. (b) Convergence of genetic algorithm search for best exploitation strategies, by influence function type.</w:t>
+        <w:t xml:space="preserve">Fig. 6 </w:t>
+      </w:r>
+      <w:r>
+        <w:rPr>
+          <w:sz w:val="20"/>
+        </w:rPr>
+        <w:t>Adversarial robustness analysis. (a) Exploitability index by strategy type and influence function. Lower values indicate greater resistance to manipulation. (b) Convergence of genetic algorithm search for best exploitation strategies, by influence function type</w:t>
       </w:r>
     </w:p>
     <w:p>
@@ -1528,10 +1558,16 @@
       </w:pPr>
       <w:r>
         <w:rPr>
-          <w:i/>
+          <w:b/>
           <w:sz w:val="20"/>
         </w:rPr>
-        <w:t>Fig. 7 Empirical calibration and counterfactual analysis. (a) Distribution of pledge fulfillment scores from the Polimeter project (N=1,050) with Thomson et al. [10] reference benchmarks. (b) Cross-national comparison of mean pledge fulfillment rates. (c) Counterfactual trust coefficient trajectory under TATSUKI applied to Trudeau's three parliamentary terms. (d) Comparison of original and empirically calibrated Beta distributions for candidate fulfillment behavior.</w:t>
+        <w:t xml:space="preserve">Fig. 7 </w:t>
+      </w:r>
+      <w:r>
+        <w:rPr>
+          <w:sz w:val="20"/>
+        </w:rPr>
+        <w:t>Empirical calibration and counterfactual analysis. (a) Distribution of pledge fulfillment scores from the Polimeter project (N=1,050) with Thomson et al. [10] reference benchmarks. (b) Cross-national comparison of mean pledge fulfillment rates. (c) Counterfactual trust coefficient trajectory under TATSUKI applied to Trudeau's three parliamentary terms. (d) Comparison of original and empirically calibrated Beta distributions for candidate fulfillment behavior</w:t>
       </w:r>
     </w:p>
     <w:p>
@@ -1575,12 +1611,12 @@
     </w:p>
     <w:p>
       <w:r>
-        <w:t>Our results demonstrate that TATSUKI can significantly improve electoral accountability compared to standard elections. The mechanism works through two channels: a direct incentive effect (candidates adjust behavior to maintain high trust coefficients) and an evolutionary selection effect (the political system selects for candidates with genuine fulfillment capacity). The combination of these channels produces sustained accountability improvements over time.</w:t>
+        <w:t>The simulation results demonstrate that TATSUKI can substantially improve electoral accountability compared to standard elections. The mechanism operates through two complementary channels: a direct incentive effect, whereby candidates adjust behavior to maintain high trust coefficients, and an evolutionary selection effect, whereby the political system differentially retains candidates with genuine fulfillment capacity. The combination of these channels produces sustained accountability improvements over multiple electoral cycles.</w:t>
       </w:r>
     </w:p>
     <w:p>
       <w:r>
-        <w:t>The analysis of the influence function family reveals a principled basis for institutional design. Concave and sigmoid functions offer the best balance: they provide strong incentives for moderate performers to improve (steep gradient at low S) while limiting the marginal gain from gaming near the top, thus discouraging costly but marginally rewarding manipulation.</w:t>
+        <w:t>The analysis of the influence function family reveals a principled, empirically grounded basis for institutional design. Concave and sigmoid functions provide the most favorable balance: they generate strong incentives for moderate performers to improve (steep gradient at low S) while limiting the marginal gain from gaming near the top, thereby discouraging costly but marginally rewarding manipulation attempts.</w:t>
       </w:r>
     </w:p>
     <w:p>
@@ -1593,12 +1629,42 @@
         <w:pStyle w:val="Heading2"/>
       </w:pPr>
       <w:r>
-        <w:t>6.2 Methodological Contribution</w:t>
+        <w:t>6.2 Methodological Contribution to Computational Social Science</w:t>
       </w:r>
     </w:p>
     <w:p>
       <w:r>
-        <w:t>From a computational social science perspective, this study demonstrates the value of combining agent-based modeling with empirical calibration for evaluating institutional designs. The ODD protocol ensures reproducibility and transparency, while the integration of real-world pledge fulfillment data (Polimeter and Thomson et al. databases) grounds the simulation in empirically observed behavioral patterns. The adversarial robustness analysis using genetic algorithms represents a novel application of evolutionary computation to institutional stress-testing, providing a systematic methodology for evaluating the manipulation resistance of proposed democratic mechanisms.</w:t>
+        <w:t>Beyond its substantive findings, this study contributes a replicable computational methodology for evaluating proposed institutional designs—a growing need in computational social science. The approach integrates three computational components that, taken together, address the key challenges of institutional evaluation.</w:t>
+      </w:r>
+    </w:p>
+    <w:p>
+      <w:r>
+        <w:t>First, the ODD-compliant agent-based model provides a transparent, reproducible platform for simulating complex multi-agent dynamics that resist closed-form analysis. By specifying agent heterogeneity (sincere, populist, and strategic-deceptive types), evolutionary selection, and feedback loops through trust coefficients, the ABM captures emergent phenomena—such as the gradual displacement of populist candidates—that would be difficult to predict from first principles alone.</w:t>
+      </w:r>
+    </w:p>
+    <w:p>
+      <w:r>
+        <w:t>Second, the empirical calibration pipeline demonstrates how large-scale observational datasets—here, 1,050 coded promises from the Polimeter project and cross-national benchmarks from more than 20,000 pledges—can be integrated into simulation models to constrain parameter spaces and validate behavioral assumptions. The close convergence between the Polimeter mean (0.596) and Thomson et al.'s cross-national benchmark for minority governments (0.61) provides external validation of the calibration approach.</w:t>
+      </w:r>
+    </w:p>
+    <w:p>
+      <w:r>
+        <w:t>Third, the adversarial robustness analysis using genetic algorithms represents, to our knowledge, a novel application of evolutionary computation to institutional stress-testing. Rather than relying on researcher intuition to identify plausible manipulation strategies, the GA systematically searches the strategy space, providing a more rigorous basis for evaluating manipulation resistance. This methodology is generalizable to other mechanism design problems in political science, public economics, and organizational governance.</w:t>
+      </w:r>
+    </w:p>
+    <w:p>
+      <w:r>
+        <w:t xml:space="preserve">Taken together, these components offer a template for computational evaluation of institutional proposals that balances theoretical rigor with empirical grounding—a combination that has been identified as a priority for computational social science </w:t>
+      </w:r>
+      <w:r>
+        <w:rPr>
+          <w:sz w:val="18"/>
+          <w:vertAlign w:val="superscript"/>
+        </w:rPr>
+        <w:t>[30]</w:t>
+      </w:r>
+      <w:r>
+        <w:t>.</w:t>
       </w:r>
     </w:p>
     <w:p>
@@ -1634,7 +1700,7 @@
     </w:p>
     <w:p>
       <w:r>
-        <w:t xml:space="preserve">Several limitations warrant acknowledgment. First, our simulation results depend on stylized assumptions about candidate types and voter behavior. Real-world electoral dynamics involve richer strategic interactions, coalition politics, and institutional constraints. Second, the effectiveness of the evaluation mechanism assumes that pledge fulfillment can be reliably and impartially assessed. While the empirical pledge fulfillment literature </w:t>
+        <w:t xml:space="preserve">Several limitations warrant acknowledgment. First, the simulation relies on stylized assumptions about candidate types and voter behavior. Real-world electoral dynamics involve richer strategic interactions, coalition politics, and institutional constraints that our three-type model does not fully capture. Second, the mechanism's effectiveness presupposes that pledge fulfillment can be reliably and impartially assessed. Although the empirical pledge-fulfillment literature </w:t>
       </w:r>
       <w:r>
         <w:rPr>
@@ -1644,12 +1710,12 @@
         <w:t>[10]</w:t>
       </w:r>
       <w:r>
-        <w:t xml:space="preserve"> supports feasibility, the implementation of an evaluation body raises questions of institutional design and political independence.</w:t>
+        <w:t xml:space="preserve"> supports the feasibility of such evaluation, the implementation of an independent evaluation body raises substantive questions of institutional design, political independence, and public legitimacy.</w:t>
       </w:r>
     </w:p>
     <w:p>
       <w:r>
-        <w:t xml:space="preserve">Third, we have not formally characterized the full strategy-proofness properties of TATSUKI in the spirit of Gibbard–Satterthwaite </w:t>
+        <w:t xml:space="preserve">Third, we have not formally characterized the full strategy-proofness properties of TATSUKI in the spirit of the Gibbard–Satterthwaite framework </w:t>
       </w:r>
       <w:r>
         <w:rPr>
@@ -1659,7 +1725,7 @@
         <w:t>[18, 19]</w:t>
       </w:r>
       <w:r>
-        <w:t>. The adversarial GA analysis provides empirical evidence of robustness, but a complete impossibility or possibility result for the TATSUKI mechanism class remains an important open question. Fourth, the interaction between TATSUKI and existing institutional features (federalism, coalition governance, term limits) has not been modeled and likely introduces additional complexity.</w:t>
+        <w:t>. While the adversarial genetic-algorithm analysis provides computational evidence of robustness, a complete impossibility or possibility result for the TATSUKI mechanism class remains an important open question for future theoretical work. Fourth, the interaction between TATSUKI and existing institutional features—federalism, coalition governance, term limits—has not been modeled and likely introduces additional complexity that warrants dedicated investigation.</w:t>
       </w:r>
     </w:p>
     <w:p>
@@ -1718,7 +1784,7 @@
     </w:p>
     <w:p>
       <w:r>
-        <w:t xml:space="preserve">We have introduced Trust-Adjusted Transparent Scoring with Unified Knowledge Integration (TATSUKI), a novel electoral mechanism that institutionalizes retrospective accountability by linking candidate trust coefficients to measured policy fulfillment. Through an ODD-compliant agent-based model calibrated with empirical pledge fulfillment data from the Polimeter project and cross-national benchmarks from Thomson et al. </w:t>
+        <w:t xml:space="preserve">This paper has introduced Trust-Adjusted Transparent Scoring with Unified Knowledge Integration (TATSUKI), a novel electoral mechanism that institutionalizes retrospective accountability by linking candidate trust coefficients to measured policy fulfillment. Through an ODD-compliant agent-based model calibrated against empirical pledge-fulfillment data from the Polimeter project and cross-national benchmarks from Thomson et al. </w:t>
       </w:r>
       <w:r>
         <w:rPr>
@@ -1728,7 +1794,12 @@
         <w:t>[10]</w:t>
       </w:r>
       <w:r>
-        <w:t>, we demonstrated that TATSUKI raises accountability levels, selects for sincere candidates, and exhibits robustness to adversarial exploitation. Counterfactual analysis using real-world data from three Canadian parliamentary terms confirms that TATSUKI produces stable, interpretable trust trajectories consistent with observed fulfillment patterns. The mechanism is parameterized by a family of influence functions, with concave and sigmoid specifications offering the best trade-off between incentive strength and manipulation resistance. By framing the trust adjustment at the candidate level rather than the voter level, TATSUKI maintains compatibility with the one-person-one-vote principle while introducing a principled mechanism for performance-based electoral influence.</w:t>
+        <w:t>, we have demonstrated that TATSUKI raises accountability levels, selects for sincere candidates, and exhibits robustness to adversarial exploitation strategies discovered through genetic-algorithm search. Counterfactual analysis using data from three Canadian parliamentary terms confirms that TATSUKI produces stable, interpretable trust trajectories consistent with observed fulfillment patterns. The mechanism is parameterized by a family of influence functions, with concave and sigmoid specifications offering the most favorable trade-off between incentive strength and manipulation resistance.</w:t>
+      </w:r>
+    </w:p>
+    <w:p>
+      <w:r>
+        <w:t>Beyond the substantive contribution, the computational methodology presented here—combining agent-based simulation, empirical calibration against large-scale observational data, and algorithmic adversarial testing—offers a replicable template for evaluating institutional design proposals in computational social science. By framing the trust adjustment at the candidate level rather than the voter level, TATSUKI maintains compatibility with the one-person-one-vote principle while introducing a principled, computationally grounded mechanism for performance-based electoral influence.</w:t>
       </w:r>
     </w:p>
     <w:p>

</xml_diff>